<commit_message>
sửa chữ ký trong file điều lệ
</commit_message>
<xml_diff>
--- a/assets/2 thành viên/01. Điều lệ.docx
+++ b/assets/2 thành viên/01. Điều lệ.docx
@@ -46579,6 +46579,39 @@
     </w:p>
     <w:p>
       <w:pPr>
+        <w:spacing w:after="0" w:line="300" w:lineRule="auto"/>
+        <w:contextualSpacing/>
+        <w:jc w:val="both"/>
+        <w:rPr>
+          <w:sz w:val="25"/>
+          <w:szCs w:val="25"/>
+        </w:rPr>
+      </w:pPr>
+    </w:p>
+    <w:p>
+      <w:pPr>
+        <w:spacing w:after="0" w:line="300" w:lineRule="auto"/>
+        <w:contextualSpacing/>
+        <w:jc w:val="both"/>
+        <w:rPr>
+          <w:sz w:val="25"/>
+          <w:szCs w:val="25"/>
+        </w:rPr>
+      </w:pPr>
+    </w:p>
+    <w:p>
+      <w:pPr>
+        <w:spacing w:after="0" w:line="300" w:lineRule="auto"/>
+        <w:contextualSpacing/>
+        <w:jc w:val="both"/>
+        <w:rPr>
+          <w:sz w:val="25"/>
+          <w:szCs w:val="25"/>
+        </w:rPr>
+      </w:pPr>
+    </w:p>
+    <w:p>
+      <w:pPr>
         <w:tabs>
           <w:tab w:val="left" w:pos="284"/>
         </w:tabs>
@@ -46593,18 +46626,386 @@
     </w:p>
     <w:p>
       <w:pPr>
+        <w:pStyle w:val="NormalWeb"/>
         <w:tabs>
-          <w:tab w:val="left" w:pos="284"/>
+          <w:tab w:val="left" w:pos="567"/>
+          <w:tab w:val="left" w:pos="2294"/>
         </w:tabs>
-        <w:spacing w:after="0" w:line="300" w:lineRule="auto"/>
+        <w:spacing w:before="0" w:beforeAutospacing="0" w:after="0" w:afterAutospacing="0" w:line="300" w:lineRule="auto"/>
         <w:jc w:val="center"/>
         <w:rPr>
           <w:b/>
-          <w:sz w:val="25"/>
-          <w:szCs w:val="25"/>
-        </w:rPr>
-      </w:pPr>
+          <w:lang w:val="vi-VN"/>
+        </w:rPr>
+      </w:pPr>
+      <w:r>
+        <w:rPr>
+          <w:b/>
+        </w:rPr>
+        <w:t xml:space="preserve">CHỮ KÝ CỦA CÁC </w:t>
+      </w:r>
+      <w:r>
+        <w:rPr>
+          <w:b/>
+        </w:rPr>
+        <w:t>THÀNH VIÊN</w:t>
+      </w:r>
     </w:p>
+    <w:tbl>
+      <w:tblPr>
+        <w:tblW w:w="9856" w:type="dxa"/>
+        <w:tblLook w:val="04A0" w:firstRow="1" w:lastRow="0" w:firstColumn="1" w:lastColumn="0" w:noHBand="0" w:noVBand="1"/>
+      </w:tblPr>
+      <w:tblGrid>
+        <w:gridCol w:w="5070"/>
+        <w:gridCol w:w="4786"/>
+      </w:tblGrid>
+      <w:tr>
+        <w:tc>
+          <w:tcPr>
+            <w:tcW w:w="5070" w:type="dxa"/>
+          </w:tcPr>
+          <w:p>
+            <w:pPr>
+              <w:pStyle w:val="NormalWeb"/>
+              <w:tabs>
+                <w:tab w:val="left" w:pos="567"/>
+                <w:tab w:val="left" w:pos="2294"/>
+              </w:tabs>
+              <w:spacing w:before="0" w:beforeAutospacing="0" w:after="0" w:afterAutospacing="0" w:line="288" w:lineRule="auto"/>
+              <w:jc w:val="center"/>
+              <w:rPr>
+                <w:b/>
+                <w:lang w:val="vi-VN"/>
+              </w:rPr>
+            </w:pPr>
+          </w:p>
+          <w:p>
+            <w:pPr>
+              <w:pStyle w:val="NormalWeb"/>
+              <w:tabs>
+                <w:tab w:val="left" w:pos="567"/>
+                <w:tab w:val="left" w:pos="2294"/>
+              </w:tabs>
+              <w:spacing w:before="0" w:beforeAutospacing="0" w:after="0" w:afterAutospacing="0" w:line="288" w:lineRule="auto"/>
+              <w:jc w:val="center"/>
+              <w:rPr>
+                <w:b/>
+                <w:lang w:val="vi-VN"/>
+              </w:rPr>
+            </w:pPr>
+          </w:p>
+          <w:p>
+            <w:pPr>
+              <w:pStyle w:val="NormalWeb"/>
+              <w:tabs>
+                <w:tab w:val="left" w:pos="567"/>
+                <w:tab w:val="left" w:pos="2294"/>
+              </w:tabs>
+              <w:spacing w:before="0" w:beforeAutospacing="0" w:after="0" w:afterAutospacing="0" w:line="288" w:lineRule="auto"/>
+              <w:jc w:val="center"/>
+              <w:rPr>
+                <w:b/>
+              </w:rPr>
+            </w:pPr>
+          </w:p>
+          <w:p>
+            <w:pPr>
+              <w:pStyle w:val="NormalWeb"/>
+              <w:tabs>
+                <w:tab w:val="left" w:pos="567"/>
+                <w:tab w:val="left" w:pos="2294"/>
+              </w:tabs>
+              <w:spacing w:before="0" w:beforeAutospacing="0" w:after="0" w:afterAutospacing="0" w:line="288" w:lineRule="auto"/>
+              <w:jc w:val="center"/>
+              <w:rPr>
+                <w:b/>
+              </w:rPr>
+            </w:pPr>
+          </w:p>
+          <w:p>
+            <w:pPr>
+              <w:pStyle w:val="NormalWeb"/>
+              <w:tabs>
+                <w:tab w:val="left" w:pos="567"/>
+                <w:tab w:val="left" w:pos="2294"/>
+              </w:tabs>
+              <w:spacing w:before="0" w:beforeAutospacing="0" w:after="0" w:afterAutospacing="0" w:line="288" w:lineRule="auto"/>
+              <w:jc w:val="center"/>
+              <w:rPr>
+                <w:b/>
+              </w:rPr>
+            </w:pPr>
+          </w:p>
+          <w:p>
+            <w:pPr>
+              <w:pStyle w:val="NormalWeb"/>
+              <w:tabs>
+                <w:tab w:val="left" w:pos="567"/>
+                <w:tab w:val="left" w:pos="2294"/>
+              </w:tabs>
+              <w:spacing w:before="0" w:beforeAutospacing="0" w:after="0" w:afterAutospacing="0" w:line="288" w:lineRule="auto"/>
+              <w:jc w:val="center"/>
+              <w:rPr>
+                <w:b/>
+              </w:rPr>
+            </w:pPr>
+          </w:p>
+          <w:p>
+            <w:pPr>
+              <w:pStyle w:val="NormalWeb"/>
+              <w:tabs>
+                <w:tab w:val="left" w:pos="567"/>
+                <w:tab w:val="left" w:pos="2294"/>
+              </w:tabs>
+              <w:spacing w:before="0" w:beforeAutospacing="0" w:after="0" w:afterAutospacing="0" w:line="288" w:lineRule="auto"/>
+              <w:jc w:val="center"/>
+              <w:rPr>
+                <w:b/>
+              </w:rPr>
+            </w:pPr>
+            <w:r>
+              <w:rPr>
+                <w:b/>
+                <w:bCs/>
+                <w:spacing w:val="-2"/>
+              </w:rPr>
+              <w:t>{#ds_chu_</w:t>
+            </w:r>
+            <w:proofErr w:type="gramStart"/>
+            <w:r>
+              <w:rPr>
+                <w:b/>
+                <w:bCs/>
+                <w:spacing w:val="-2"/>
+              </w:rPr>
+              <w:t>ky}</w:t>
+            </w:r>
+            <w:r>
+              <w:rPr>
+                <w:b/>
+              </w:rPr>
+              <w:t>{</w:t>
+            </w:r>
+            <w:proofErr w:type="gramEnd"/>
+            <w:r>
+              <w:rPr>
+                <w:b/>
+              </w:rPr>
+              <w:t>ba_cham_1}</w:t>
+            </w:r>
+          </w:p>
+          <w:p>
+            <w:pPr>
+              <w:pStyle w:val="NormalWeb"/>
+              <w:tabs>
+                <w:tab w:val="left" w:pos="567"/>
+                <w:tab w:val="left" w:pos="2294"/>
+              </w:tabs>
+              <w:spacing w:before="0" w:beforeAutospacing="0" w:after="0" w:afterAutospacing="0" w:line="300" w:lineRule="auto"/>
+              <w:jc w:val="center"/>
+              <w:rPr>
+                <w:b/>
+              </w:rPr>
+            </w:pPr>
+            <w:r>
+              <w:rPr>
+                <w:b/>
+                <w:bCs/>
+                <w:spacing w:val="-2"/>
+              </w:rPr>
+              <w:t>{ho_ten_1}</w:t>
+            </w:r>
+          </w:p>
+        </w:tc>
+        <w:tc>
+          <w:tcPr>
+            <w:tcW w:w="4786" w:type="dxa"/>
+          </w:tcPr>
+          <w:p>
+            <w:pPr>
+              <w:pStyle w:val="NormalWeb"/>
+              <w:tabs>
+                <w:tab w:val="left" w:pos="567"/>
+                <w:tab w:val="left" w:pos="2294"/>
+              </w:tabs>
+              <w:spacing w:before="0" w:beforeAutospacing="0" w:after="0" w:afterAutospacing="0" w:line="288" w:lineRule="auto"/>
+              <w:jc w:val="center"/>
+              <w:rPr>
+                <w:b/>
+                <w:lang w:val="vi-VN"/>
+              </w:rPr>
+            </w:pPr>
+          </w:p>
+          <w:p>
+            <w:pPr>
+              <w:pStyle w:val="NormalWeb"/>
+              <w:tabs>
+                <w:tab w:val="left" w:pos="567"/>
+                <w:tab w:val="left" w:pos="2294"/>
+              </w:tabs>
+              <w:spacing w:before="0" w:beforeAutospacing="0" w:after="0" w:afterAutospacing="0" w:line="288" w:lineRule="auto"/>
+              <w:jc w:val="center"/>
+              <w:rPr>
+                <w:b/>
+                <w:lang w:val="vi-VN"/>
+              </w:rPr>
+            </w:pPr>
+          </w:p>
+          <w:p>
+            <w:pPr>
+              <w:pStyle w:val="NormalWeb"/>
+              <w:tabs>
+                <w:tab w:val="left" w:pos="567"/>
+                <w:tab w:val="left" w:pos="2294"/>
+              </w:tabs>
+              <w:spacing w:before="0" w:beforeAutospacing="0" w:after="0" w:afterAutospacing="0" w:line="288" w:lineRule="auto"/>
+              <w:jc w:val="center"/>
+              <w:rPr>
+                <w:b/>
+              </w:rPr>
+            </w:pPr>
+          </w:p>
+          <w:p>
+            <w:pPr>
+              <w:pStyle w:val="NormalWeb"/>
+              <w:tabs>
+                <w:tab w:val="left" w:pos="567"/>
+                <w:tab w:val="left" w:pos="2294"/>
+              </w:tabs>
+              <w:spacing w:before="0" w:beforeAutospacing="0" w:after="0" w:afterAutospacing="0" w:line="288" w:lineRule="auto"/>
+              <w:jc w:val="center"/>
+              <w:rPr>
+                <w:b/>
+              </w:rPr>
+            </w:pPr>
+          </w:p>
+          <w:p>
+            <w:pPr>
+              <w:pStyle w:val="NormalWeb"/>
+              <w:tabs>
+                <w:tab w:val="left" w:pos="567"/>
+                <w:tab w:val="left" w:pos="2294"/>
+              </w:tabs>
+              <w:spacing w:before="0" w:beforeAutospacing="0" w:after="0" w:afterAutospacing="0" w:line="288" w:lineRule="auto"/>
+              <w:jc w:val="center"/>
+              <w:rPr>
+                <w:b/>
+              </w:rPr>
+            </w:pPr>
+          </w:p>
+          <w:p>
+            <w:pPr>
+              <w:pStyle w:val="NormalWeb"/>
+              <w:tabs>
+                <w:tab w:val="left" w:pos="567"/>
+                <w:tab w:val="left" w:pos="2294"/>
+              </w:tabs>
+              <w:spacing w:before="0" w:beforeAutospacing="0" w:after="0" w:afterAutospacing="0" w:line="288" w:lineRule="auto"/>
+              <w:jc w:val="center"/>
+              <w:rPr>
+                <w:b/>
+              </w:rPr>
+            </w:pPr>
+          </w:p>
+          <w:p>
+            <w:pPr>
+              <w:pStyle w:val="NormalWeb"/>
+              <w:tabs>
+                <w:tab w:val="left" w:pos="567"/>
+                <w:tab w:val="left" w:pos="2294"/>
+              </w:tabs>
+              <w:spacing w:before="0" w:beforeAutospacing="0" w:after="0" w:afterAutospacing="0" w:line="288" w:lineRule="auto"/>
+              <w:jc w:val="center"/>
+              <w:rPr>
+                <w:b/>
+              </w:rPr>
+            </w:pPr>
+            <w:r>
+              <w:rPr>
+                <w:b/>
+              </w:rPr>
+              <w:t>{ba_cham_2}</w:t>
+            </w:r>
+          </w:p>
+          <w:p>
+            <w:pPr>
+              <w:pStyle w:val="NormalWeb"/>
+              <w:tabs>
+                <w:tab w:val="left" w:pos="567"/>
+                <w:tab w:val="left" w:pos="2294"/>
+              </w:tabs>
+              <w:spacing w:before="0" w:beforeAutospacing="0" w:after="0" w:afterAutospacing="0" w:line="300" w:lineRule="auto"/>
+              <w:jc w:val="center"/>
+              <w:rPr>
+                <w:b/>
+                <w:lang w:val="vi-VN"/>
+              </w:rPr>
+            </w:pPr>
+            <w:r>
+              <w:rPr>
+                <w:b/>
+                <w:lang w:val="pt-BR" w:eastAsia="ar-SA"/>
+              </w:rPr>
+              <w:t>{ho_ten_</w:t>
+            </w:r>
+            <w:proofErr w:type="gramStart"/>
+            <w:r>
+              <w:rPr>
+                <w:b/>
+                <w:lang w:val="pt-BR" w:eastAsia="ar-SA"/>
+              </w:rPr>
+              <w:t>2}{</w:t>
+            </w:r>
+            <w:proofErr w:type="gramEnd"/>
+            <w:r>
+              <w:rPr>
+                <w:b/>
+                <w:lang w:val="pt-BR" w:eastAsia="ar-SA"/>
+              </w:rPr>
+              <w:t>/</w:t>
+            </w:r>
+            <w:proofErr w:type="spellStart"/>
+            <w:r>
+              <w:rPr>
+                <w:b/>
+                <w:lang w:val="pt-BR" w:eastAsia="ar-SA"/>
+              </w:rPr>
+              <w:t>ds_chu_</w:t>
+            </w:r>
+            <w:proofErr w:type="gramStart"/>
+            <w:r>
+              <w:rPr>
+                <w:b/>
+                <w:lang w:val="pt-BR" w:eastAsia="ar-SA"/>
+              </w:rPr>
+              <w:t>ky</w:t>
+            </w:r>
+            <w:proofErr w:type="spellEnd"/>
+            <w:r>
+              <w:rPr>
+                <w:b/>
+                <w:lang w:val="pt-BR" w:eastAsia="ar-SA"/>
+              </w:rPr>
+              <w:t>}</w:t>
+            </w:r>
+            <w:r>
+              <w:rPr>
+                <w:lang w:val="vi-VN"/>
+              </w:rPr>
+              <w:t xml:space="preserve"> </w:t>
+            </w:r>
+            <w:r>
+              <w:t xml:space="preserve">  </w:t>
+            </w:r>
+            <w:proofErr w:type="gramEnd"/>
+            <w:r>
+              <w:t xml:space="preserve">           </w:t>
+            </w:r>
+          </w:p>
+        </w:tc>
+      </w:tr>
+    </w:tbl>
     <w:p>
       <w:pPr>
         <w:widowControl w:val="0"/>
@@ -46620,238 +47021,10 @@
         <w:rPr>
           <w:b/>
           <w:bCs/>
-          <w:spacing w:val="3"/>
-          <w:sz w:val="25"/>
-          <w:szCs w:val="25"/>
-          <w:shd w:val="clear" w:color="auto" w:fill="FFFFFF"/>
-        </w:rPr>
-      </w:pPr>
-    </w:p>
-    <w:tbl>
-      <w:tblPr>
-        <w:tblStyle w:val="TableGrid"/>
-        <w:tblW w:w="10207" w:type="dxa"/>
-        <w:tblInd w:w="-289" w:type="dxa"/>
-        <w:tblBorders>
-          <w:top w:val="none" w:sz="0" w:space="0" w:color="auto"/>
-          <w:left w:val="none" w:sz="0" w:space="0" w:color="auto"/>
-          <w:bottom w:val="none" w:sz="0" w:space="0" w:color="auto"/>
-          <w:right w:val="none" w:sz="0" w:space="0" w:color="auto"/>
-          <w:insideH w:val="none" w:sz="0" w:space="0" w:color="auto"/>
-          <w:insideV w:val="none" w:sz="0" w:space="0" w:color="auto"/>
-        </w:tblBorders>
-        <w:tblLook w:val="04A0" w:firstRow="1" w:lastRow="0" w:firstColumn="1" w:lastColumn="0" w:noHBand="0" w:noVBand="1"/>
-      </w:tblPr>
-      <w:tblGrid>
-        <w:gridCol w:w="10207"/>
-      </w:tblGrid>
-      <w:tr>
-        <w:tc>
-          <w:tcPr>
-            <w:tcW w:w="10207" w:type="dxa"/>
-          </w:tcPr>
-          <w:p>
-            <w:pPr>
-              <w:pStyle w:val="NormalWeb"/>
-              <w:tabs>
-                <w:tab w:val="left" w:pos="284"/>
-              </w:tabs>
-              <w:spacing w:before="0" w:beforeAutospacing="0" w:after="0" w:afterAutospacing="0" w:line="300" w:lineRule="auto"/>
-              <w:jc w:val="center"/>
-              <w:rPr>
-                <w:b/>
-                <w:bCs/>
-                <w:sz w:val="25"/>
-                <w:szCs w:val="25"/>
-              </w:rPr>
-            </w:pPr>
-            <w:r>
-              <w:rPr>
-                <w:b/>
-                <w:bCs/>
-                <w:sz w:val="25"/>
-                <w:szCs w:val="25"/>
-              </w:rPr>
-              <w:t>CHỮ KÝ CỦA CÁC THÀNH VIÊN</w:t>
-            </w:r>
-          </w:p>
-          <w:p>
-            <w:pPr>
-              <w:widowControl w:val="0"/>
-              <w:tabs>
-                <w:tab w:val="center" w:pos="4920"/>
-              </w:tabs>
-              <w:autoSpaceDE w:val="0"/>
-              <w:autoSpaceDN w:val="0"/>
-              <w:adjustRightInd w:val="0"/>
-              <w:spacing w:line="300" w:lineRule="auto"/>
-              <w:contextualSpacing/>
-              <w:jc w:val="center"/>
-              <w:rPr>
-                <w:sz w:val="25"/>
-                <w:szCs w:val="25"/>
-              </w:rPr>
-            </w:pPr>
-          </w:p>
-          <w:p>
-            <w:pPr>
-              <w:widowControl w:val="0"/>
-              <w:tabs>
-                <w:tab w:val="center" w:pos="4920"/>
-              </w:tabs>
-              <w:autoSpaceDE w:val="0"/>
-              <w:autoSpaceDN w:val="0"/>
-              <w:adjustRightInd w:val="0"/>
-              <w:spacing w:line="300" w:lineRule="auto"/>
-              <w:contextualSpacing/>
-              <w:jc w:val="center"/>
-              <w:rPr>
-                <w:sz w:val="25"/>
-                <w:szCs w:val="25"/>
-              </w:rPr>
-            </w:pPr>
-          </w:p>
-          <w:p>
-            <w:pPr>
-              <w:widowControl w:val="0"/>
-              <w:tabs>
-                <w:tab w:val="center" w:pos="4920"/>
-              </w:tabs>
-              <w:autoSpaceDE w:val="0"/>
-              <w:autoSpaceDN w:val="0"/>
-              <w:adjustRightInd w:val="0"/>
-              <w:spacing w:line="300" w:lineRule="auto"/>
-              <w:contextualSpacing/>
-              <w:jc w:val="center"/>
-              <w:rPr>
-                <w:sz w:val="25"/>
-                <w:szCs w:val="25"/>
-              </w:rPr>
-            </w:pPr>
-          </w:p>
-          <w:p>
-            <w:pPr>
-              <w:widowControl w:val="0"/>
-              <w:tabs>
-                <w:tab w:val="center" w:pos="4920"/>
-              </w:tabs>
-              <w:autoSpaceDE w:val="0"/>
-              <w:autoSpaceDN w:val="0"/>
-              <w:adjustRightInd w:val="0"/>
-              <w:spacing w:line="300" w:lineRule="auto"/>
-              <w:contextualSpacing/>
-              <w:jc w:val="center"/>
-              <w:rPr>
-                <w:sz w:val="25"/>
-                <w:szCs w:val="25"/>
-              </w:rPr>
-            </w:pPr>
-          </w:p>
-          <w:p>
-            <w:pPr>
-              <w:widowControl w:val="0"/>
-              <w:tabs>
-                <w:tab w:val="center" w:pos="4920"/>
-              </w:tabs>
-              <w:autoSpaceDE w:val="0"/>
-              <w:autoSpaceDN w:val="0"/>
-              <w:adjustRightInd w:val="0"/>
-              <w:spacing w:line="300" w:lineRule="auto"/>
-              <w:contextualSpacing/>
-              <w:jc w:val="center"/>
-              <w:rPr>
-                <w:sz w:val="25"/>
-                <w:szCs w:val="25"/>
-              </w:rPr>
-            </w:pPr>
-          </w:p>
-          <w:p>
-            <w:pPr>
-              <w:widowControl w:val="0"/>
-              <w:tabs>
-                <w:tab w:val="center" w:pos="4920"/>
-              </w:tabs>
-              <w:autoSpaceDE w:val="0"/>
-              <w:autoSpaceDN w:val="0"/>
-              <w:adjustRightInd w:val="0"/>
-              <w:spacing w:line="300" w:lineRule="auto"/>
-              <w:contextualSpacing/>
-              <w:jc w:val="center"/>
-              <w:rPr>
-                <w:sz w:val="25"/>
-                <w:szCs w:val="25"/>
-              </w:rPr>
-            </w:pPr>
-          </w:p>
-          <w:p>
-            <w:pPr>
-              <w:widowControl w:val="0"/>
-              <w:tabs>
-                <w:tab w:val="center" w:pos="4920"/>
-              </w:tabs>
-              <w:autoSpaceDE w:val="0"/>
-              <w:autoSpaceDN w:val="0"/>
-              <w:adjustRightInd w:val="0"/>
-              <w:spacing w:line="300" w:lineRule="auto"/>
-              <w:contextualSpacing/>
-              <w:jc w:val="center"/>
-              <w:rPr>
-                <w:sz w:val="25"/>
-                <w:szCs w:val="25"/>
-              </w:rPr>
-            </w:pPr>
-          </w:p>
-        </w:tc>
-      </w:tr>
-    </w:tbl>
-    <w:p>
-      <w:pPr>
-        <w:widowControl w:val="0"/>
-        <w:tabs>
-          <w:tab w:val="center" w:pos="4920"/>
-        </w:tabs>
-        <w:autoSpaceDE w:val="0"/>
-        <w:autoSpaceDN w:val="0"/>
-        <w:adjustRightInd w:val="0"/>
-        <w:spacing w:after="0" w:line="300" w:lineRule="auto"/>
-        <w:contextualSpacing/>
-        <w:jc w:val="center"/>
-        <w:rPr>
-          <w:b/>
-          <w:bCs/>
-          <w:sz w:val="25"/>
-          <w:szCs w:val="25"/>
-        </w:rPr>
-      </w:pPr>
-      <w:r>
-        <w:rPr>
-          <w:b/>
-          <w:bCs/>
-          <w:sz w:val="25"/>
-          <w:szCs w:val="25"/>
-        </w:rPr>
-        <w:t>{</w:t>
-      </w:r>
-      <w:proofErr w:type="spellStart"/>
-      <w:r>
-        <w:rPr>
-          <w:b/>
-          <w:bCs/>
-          <w:sz w:val="25"/>
-          <w:szCs w:val="25"/>
-        </w:rPr>
-        <w:t>ho_ten</w:t>
-      </w:r>
-      <w:proofErr w:type="spellEnd"/>
-      <w:r>
-        <w:rPr>
-          <w:b/>
-          <w:bCs/>
-          <w:sz w:val="25"/>
-          <w:szCs w:val="25"/>
-        </w:rPr>
-        <w:t>}</w:t>
-      </w:r>
+          <w:sz w:val="25"/>
+          <w:szCs w:val="25"/>
+        </w:rPr>
+      </w:pPr>
     </w:p>
     <w:p>
       <w:pPr>
@@ -50153,7 +50326,7 @@
   <w:latentStyles w:defLockedState="0" w:defUIPriority="99" w:defSemiHidden="0" w:defUnhideWhenUsed="0" w:defQFormat="0" w:count="376">
     <w:lsdException w:name="Normal" w:uiPriority="0" w:qFormat="1"/>
     <w:lsdException w:name="heading 1" w:uiPriority="9" w:qFormat="1"/>
-    <w:lsdException w:name="heading 2" w:semiHidden="1" w:uiPriority="9" w:unhideWhenUsed="1" w:qFormat="1"/>
+    <w:lsdException w:name="heading 2" w:semiHidden="1" w:uiPriority="0" w:unhideWhenUsed="1" w:qFormat="1"/>
     <w:lsdException w:name="heading 3" w:semiHidden="1" w:uiPriority="9" w:unhideWhenUsed="1" w:qFormat="1"/>
     <w:lsdException w:name="heading 4" w:semiHidden="1" w:uiPriority="9" w:unhideWhenUsed="1" w:qFormat="1"/>
     <w:lsdException w:name="heading 5" w:semiHidden="1" w:uiPriority="9" w:unhideWhenUsed="1" w:qFormat="1"/>
@@ -50533,6 +50706,32 @@
     <w:qFormat/>
     <w:rsid w:val="009F4272"/>
   </w:style>
+  <w:style w:type="paragraph" w:styleId="Heading2">
+    <w:name w:val="heading 2"/>
+    <w:basedOn w:val="Normal"/>
+    <w:next w:val="Normal"/>
+    <w:link w:val="Heading2Char"/>
+    <w:qFormat/>
+    <w:rsid w:val="00FE29A6"/>
+    <w:pPr>
+      <w:keepNext/>
+      <w:tabs>
+        <w:tab w:val="left" w:leader="dot" w:pos="5670"/>
+        <w:tab w:val="left" w:leader="dot" w:pos="9356"/>
+      </w:tabs>
+      <w:spacing w:after="0" w:line="312" w:lineRule="auto"/>
+      <w:jc w:val="both"/>
+      <w:outlineLvl w:val="1"/>
+    </w:pPr>
+    <w:rPr>
+      <w:rFonts w:ascii="@Batang" w:eastAsia="Calibri" w:hAnsi="@Batang" w:cs="@Batang"/>
+      <w:b/>
+      <w:bCs/>
+      <w:sz w:val="26"/>
+      <w:szCs w:val="24"/>
+      <w:lang w:eastAsia="en-US"/>
+    </w:rPr>
+  </w:style>
   <w:style w:type="paragraph" w:styleId="Heading3">
     <w:name w:val="heading 3"/>
     <w:basedOn w:val="Normal"/>
@@ -50825,6 +51024,20 @@
     <w:rPr>
       <w:rFonts w:eastAsia="Times New Roman" w:cs="Times New Roman"/>
       <w:szCs w:val="24"/>
+    </w:rPr>
+  </w:style>
+  <w:style w:type="character" w:customStyle="1" w:styleId="Heading2Char">
+    <w:name w:val="Heading 2 Char"/>
+    <w:basedOn w:val="DefaultParagraphFont"/>
+    <w:link w:val="Heading2"/>
+    <w:rsid w:val="00FE29A6"/>
+    <w:rPr>
+      <w:rFonts w:ascii="@Batang" w:eastAsia="Calibri" w:hAnsi="@Batang" w:cs="@Batang"/>
+      <w:b/>
+      <w:bCs/>
+      <w:sz w:val="26"/>
+      <w:szCs w:val="24"/>
+      <w:lang w:eastAsia="en-US"/>
     </w:rPr>
   </w:style>
 </w:styles>

</xml_diff>